<commit_message>
fix(manuscript): bo sung YAML frontmatter va tieu de H1 cho Chuong 68, 69, 70
</commit_message>
<xml_diff>
--- a/manuscript/word/volume_01/arc_02/ch_068.docx
+++ b/manuscript/word/volume_01/arc_02/ch_068.docx
@@ -33,6 +33,141 @@
       </w:r>
     </w:p>
     <w:p/>
+    <w:p>
+      <w:pPr>
+        <w:spacing w:line="300" w:lineRule="auto" w:after="120"/>
+        <w:ind w:firstLine="432"/>
+        <w:jc w:val="both"/>
+      </w:pPr>
+      <w:r>
+        <w:rPr>
+          <w:rFonts w:ascii="Times New Roman" w:hAnsi="Times New Roman"/>
+          <w:color w:val="141414"/>
+          <w:sz w:val="24"/>
+        </w:rPr>
+        <w:t>---</w:t>
+      </w:r>
+    </w:p>
+    <w:p>
+      <w:pPr>
+        <w:spacing w:line="300" w:lineRule="auto" w:after="120"/>
+        <w:ind w:firstLine="432"/>
+        <w:jc w:val="both"/>
+      </w:pPr>
+      <w:r>
+        <w:rPr>
+          <w:rFonts w:ascii="Times New Roman" w:hAnsi="Times New Roman"/>
+          <w:color w:val="141414"/>
+          <w:sz w:val="24"/>
+        </w:rPr>
+        <w:t>chapter: 68</w:t>
+      </w:r>
+    </w:p>
+    <w:p>
+      <w:pPr>
+        <w:spacing w:line="300" w:lineRule="auto" w:after="120"/>
+        <w:ind w:firstLine="432"/>
+        <w:jc w:val="both"/>
+      </w:pPr>
+      <w:r>
+        <w:rPr>
+          <w:rFonts w:ascii="Times New Roman" w:hAnsi="Times New Roman"/>
+          <w:color w:val="141414"/>
+          <w:sz w:val="24"/>
+        </w:rPr>
+        <w:t>title: "Thanh Long Lân Kiếm"</w:t>
+      </w:r>
+    </w:p>
+    <w:p>
+      <w:pPr>
+        <w:spacing w:line="300" w:lineRule="auto" w:after="120"/>
+        <w:ind w:firstLine="432"/>
+        <w:jc w:val="both"/>
+      </w:pPr>
+      <w:r>
+        <w:rPr>
+          <w:rFonts w:ascii="Times New Roman" w:hAnsi="Times New Roman"/>
+          <w:color w:val="141414"/>
+          <w:sz w:val="24"/>
+        </w:rPr>
+        <w:t>volume: 1</w:t>
+      </w:r>
+    </w:p>
+    <w:p>
+      <w:pPr>
+        <w:spacing w:line="300" w:lineRule="auto" w:after="120"/>
+        <w:ind w:firstLine="432"/>
+        <w:jc w:val="both"/>
+      </w:pPr>
+      <w:r>
+        <w:rPr>
+          <w:rFonts w:ascii="Times New Roman" w:hAnsi="Times New Roman"/>
+          <w:color w:val="141414"/>
+          <w:sz w:val="24"/>
+        </w:rPr>
+        <w:t>arc: 2</w:t>
+      </w:r>
+    </w:p>
+    <w:p>
+      <w:pPr>
+        <w:spacing w:line="300" w:lineRule="auto" w:after="120"/>
+        <w:ind w:firstLine="432"/>
+        <w:jc w:val="both"/>
+      </w:pPr>
+      <w:r>
+        <w:rPr>
+          <w:rFonts w:ascii="Times New Roman" w:hAnsi="Times New Roman"/>
+          <w:color w:val="141414"/>
+          <w:sz w:val="24"/>
+        </w:rPr>
+        <w:t>word_count: 3464</w:t>
+      </w:r>
+    </w:p>
+    <w:p>
+      <w:pPr>
+        <w:spacing w:line="300" w:lineRule="auto" w:after="120"/>
+        <w:ind w:firstLine="432"/>
+        <w:jc w:val="both"/>
+      </w:pPr>
+      <w:r>
+        <w:rPr>
+          <w:rFonts w:ascii="Times New Roman" w:hAnsi="Times New Roman"/>
+          <w:color w:val="141414"/>
+          <w:sz w:val="24"/>
+        </w:rPr>
+        <w:t>date: "2026-10-21"</w:t>
+      </w:r>
+    </w:p>
+    <w:p>
+      <w:pPr>
+        <w:spacing w:line="300" w:lineRule="auto" w:after="120"/>
+        <w:ind w:firstLine="432"/>
+        <w:jc w:val="both"/>
+      </w:pPr>
+      <w:r>
+        <w:rPr>
+          <w:rFonts w:ascii="Times New Roman" w:hAnsi="Times New Roman"/>
+          <w:color w:val="141414"/>
+          <w:sz w:val="24"/>
+        </w:rPr>
+        <w:t>location: "Lòng rạch Bến Nghé — Chân mố Cầu Mống (Quận 1 &amp; Quận 4, TP.HCM)"</w:t>
+      </w:r>
+    </w:p>
+    <w:p>
+      <w:pPr>
+        <w:spacing w:line="300" w:lineRule="auto" w:after="120"/>
+        <w:ind w:firstLine="432"/>
+        <w:jc w:val="both"/>
+      </w:pPr>
+      <w:r>
+        <w:rPr>
+          <w:rFonts w:ascii="Times New Roman" w:hAnsi="Times New Roman"/>
+          <w:color w:val="141414"/>
+          <w:sz w:val="24"/>
+        </w:rPr>
+        <w:t>---</w:t>
+      </w:r>
+    </w:p>
     <w:p>
       <w:pPr>
         <w:spacing w:line="300" w:lineRule="auto" w:after="120"/>

</xml_diff>